<commit_message>
docs(standards): cut the landscape page's preamble
Sixty-one lines between the title and the first useful thing: a date banner,
a what-you-get list, a four-item scope-and-limits block and a three-questions
framing. A reader who has to answer 'does this reach me' met four sections of
throat-clearing before the routing block that answers it.

The page now opens on the routing block, which is the part that does the
work. The two cuts still carry their own explanations where they are used,
and the not-assessed section still says what is missing -- both survive as
sections rather than as promises made in advance.

The checked-on date moves with the individual statuses, which is where it
was already carried and where a reader actually needs it.
</commit_message>
<xml_diff>
--- a/docs/standards/word/STANDARDS-LANDSCAPE.docx
+++ b/docs/standards/word/STANDARDS-LANDSCAPE.docx
@@ -28,7 +28,7 @@
         </w:p>
       </w:sdtContent>
     </w:sdt>
-    <w:bookmarkStart w:id="51" w:name="X5f00617d65279871bdf095e7499ae789fffb5af"/>
+    <w:bookmarkStart w:id="48" w:name="X5f00617d65279871bdf095e7499ae789fffb5af"/>
     <w:p>
       <w:pPr>
         <w:pStyle w:val="Heading1"/>
@@ -127,527 +127,7 @@
         </w:pict>
       </w:r>
     </w:p>
-    <w:p>
-      <w:pPr>
-        <w:pStyle w:val="BlockText"/>
-      </w:pPr>
-      <w:r>
-        <w:rPr>
-          <w:b/>
-          <w:bCs/>
-        </w:rPr>
-        <w:t xml:space="preserve">Every status on this page was checked on 2026-08-06.</w:t>
-      </w:r>
-      <w:r>
-        <w:t xml:space="preserve"> </w:t>
-      </w:r>
-      <w:r>
-        <w:t xml:space="preserve">A compliance fact without a date is a</w:t>
-      </w:r>
-      <w:r>
-        <w:t xml:space="preserve"> </w:t>
-      </w:r>
-      <w:r>
-        <w:t xml:space="preserve">claim with a hidden expiry. Several statuses below moved inside the last twelve months, at least</w:t>
-      </w:r>
-      <w:r>
-        <w:t xml:space="preserve"> </w:t>
-      </w:r>
-      <w:r>
-        <w:t xml:space="preserve">six of those inside the last three, and more than one inside the last two weeks. Re-check before</w:t>
-      </w:r>
-      <w:r>
-        <w:t xml:space="preserve"> </w:t>
-      </w:r>
-      <w:r>
-        <w:t xml:space="preserve">quoting any of them in a contract, a questionnaire response, or a board paper.</w:t>
-      </w:r>
-    </w:p>
-    <w:bookmarkStart w:id="12" w:name="what-you-get"/>
-    <w:p>
-      <w:pPr>
-        <w:pStyle w:val="Heading2"/>
-      </w:pPr>
-      <w:r>
-        <w:t xml:space="preserve">What you get</w:t>
-      </w:r>
-    </w:p>
-    <w:p>
-      <w:pPr>
-        <w:pStyle w:val="Compact"/>
-        <w:numPr>
-          <w:ilvl w:val="0"/>
-          <w:numId w:val="1001"/>
-        </w:numPr>
-      </w:pPr>
-      <w:r>
-        <w:rPr>
-          <w:b/>
-          <w:bCs/>
-        </w:rPr>
-        <w:t xml:space="preserve">A</w:t>
-      </w:r>
-      <w:r>
-        <w:rPr>
-          <w:b/>
-          <w:bCs/>
-        </w:rPr>
-        <w:t xml:space="preserve"> </w:t>
-      </w:r>
-      <w:hyperlink w:anchor="if-this-is-your-situation">
-        <w:r>
-          <w:rPr>
-            <w:rStyle w:val="Hyperlink"/>
-            <w:b/>
-            <w:bCs/>
-          </w:rPr>
-          <w:t xml:space="preserve">routing block</w:t>
-        </w:r>
-      </w:hyperlink>
-      <w:r>
-        <w:rPr>
-          <w:b/>
-          <w:bCs/>
-        </w:rPr>
-        <w:t xml:space="preserve"> </w:t>
-      </w:r>
-      <w:r>
-        <w:rPr>
-          <w:b/>
-          <w:bCs/>
-        </w:rPr>
-        <w:t xml:space="preserve">keyed on situations you recognize about yourself</w:t>
-      </w:r>
-      <w:r>
-        <w:t xml:space="preserve">,</w:t>
-      </w:r>
-      <w:r>
-        <w:t xml:space="preserve"> </w:t>
-      </w:r>
-      <w:r>
-        <w:t xml:space="preserve">so you can find what reaches you without first knowing which category a document belongs to.</w:t>
-      </w:r>
-    </w:p>
-    <w:p>
-      <w:pPr>
-        <w:pStyle w:val="Compact"/>
-        <w:numPr>
-          <w:ilvl w:val="0"/>
-          <w:numId w:val="1001"/>
-        </w:numPr>
-      </w:pPr>
-      <w:r>
-        <w:rPr>
-          <w:b/>
-          <w:bCs/>
-        </w:rPr>
-        <w:t xml:space="preserve">Two cuts that settle most arguments</w:t>
-      </w:r>
-      <w:r>
-        <w:t xml:space="preserve">: who a document is addressed to, and what it issues when</w:t>
-      </w:r>
-      <w:r>
-        <w:t xml:space="preserve"> </w:t>
-      </w:r>
-      <w:r>
-        <w:t xml:space="preserve">you finish. Both sit outside the content, and a summary almost never carries either.</w:t>
-      </w:r>
-    </w:p>
-    <w:p>
-      <w:pPr>
-        <w:pStyle w:val="Compact"/>
-        <w:numPr>
-          <w:ilvl w:val="0"/>
-          <w:numId w:val="1001"/>
-        </w:numPr>
-      </w:pPr>
-      <w:r>
-        <w:rPr>
-          <w:b/>
-          <w:bCs/>
-        </w:rPr>
-        <w:t xml:space="preserve">A named answer for the artifact that does not exist.</w:t>
-      </w:r>
-      <w:r>
-        <w:t xml:space="preserve"> </w:t>
-      </w:r>
-      <w:r>
-        <w:t xml:space="preserve">Most items here issue nothing, so being</w:t>
-      </w:r>
-      <w:r>
-        <w:t xml:space="preserve"> </w:t>
-      </w:r>
-      <w:r>
-        <w:t xml:space="preserve">asked for a certificate is routine, and the useful reply is to say what does exist instead.</w:t>
-      </w:r>
-    </w:p>
-    <w:p>
-      <w:pPr>
-        <w:pStyle w:val="Compact"/>
-        <w:numPr>
-          <w:ilvl w:val="0"/>
-          <w:numId w:val="1001"/>
-        </w:numPr>
-      </w:pPr>
-      <w:r>
-        <w:rPr>
-          <w:b/>
-          <w:bCs/>
-        </w:rPr>
-        <w:t xml:space="preserve">At least thirteen sentences still in circulation that are now wrong</w:t>
-      </w:r>
-      <w:r>
-        <w:t xml:space="preserve">, each with a check you can</w:t>
-      </w:r>
-      <w:r>
-        <w:t xml:space="preserve"> </w:t>
-      </w:r>
-      <w:r>
-        <w:t xml:space="preserve">run without trusting this page.</w:t>
-      </w:r>
-    </w:p>
-    <w:p>
-      <w:pPr>
-        <w:pStyle w:val="Compact"/>
-        <w:numPr>
-          <w:ilvl w:val="0"/>
-          <w:numId w:val="1001"/>
-        </w:numPr>
-      </w:pPr>
-      <w:r>
-        <w:rPr>
-          <w:b/>
-          <w:bCs/>
-        </w:rPr>
-        <w:t xml:space="preserve">The gaps, named.</w:t>
-      </w:r>
-      <w:r>
-        <w:t xml:space="preserve"> </w:t>
-      </w:r>
-      <w:r>
-        <w:t xml:space="preserve">What is absent entirely, what rests on secondary reporting, and the questions</w:t>
-      </w:r>
-      <w:r>
-        <w:t xml:space="preserve"> </w:t>
-      </w:r>
-      <w:r>
-        <w:t xml:space="preserve">this page structurally cannot answer.</w:t>
-      </w:r>
-    </w:p>
-    <w:p>
-      <w:r>
-        <w:pict>
-          <v:rect style="width:0;height:1.5pt" o:hralign="center" o:hrstd="t" o:hr="t"/>
-        </w:pict>
-      </w:r>
-    </w:p>
-    <w:bookmarkEnd w:id="12"/>
-    <w:bookmarkStart w:id="14" w:name="X59e16fdc45edc897ceace49659f87fb46af9017"/>
-    <w:p>
-      <w:pPr>
-        <w:pStyle w:val="Heading2"/>
-      </w:pPr>
-      <w:r>
-        <w:t xml:space="preserve">What this page answers, and what it does not</w:t>
-      </w:r>
-    </w:p>
-    <w:p>
-      <w:pPr>
-        <w:pStyle w:val="FirstParagraph"/>
-      </w:pPr>
-      <w:r>
-        <w:t xml:space="preserve">This page answers what applies to us.</w:t>
-      </w:r>
-      <w:r>
-        <w:t xml:space="preserve"> </w:t>
-      </w:r>
-      <w:hyperlink r:id="rId13">
-        <w:r>
-          <w:rPr>
-            <w:rStyle w:val="Hyperlink"/>
-          </w:rPr>
-          <w:t xml:space="preserve">The CISO summary</w:t>
-        </w:r>
-      </w:hyperlink>
-      <w:r>
-        <w:t xml:space="preserve"> </w:t>
-      </w:r>
-      <w:r>
-        <w:t xml:space="preserve">answers a different</w:t>
-      </w:r>
-      <w:r>
-        <w:t xml:space="preserve"> </w:t>
-      </w:r>
-      <w:r>
-        <w:t xml:space="preserve">question -- whether your teams already do this -- and neither substitutes for the other. That page is</w:t>
-      </w:r>
-      <w:r>
-        <w:t xml:space="preserve"> </w:t>
-      </w:r>
-      <w:r>
-        <w:t xml:space="preserve">about your teams' practice. This one is about the external documents that arrive attached to a</w:t>
-      </w:r>
-      <w:r>
-        <w:t xml:space="preserve"> </w:t>
-      </w:r>
-      <w:r>
-        <w:t xml:space="preserve">contract, a procurement rule, or a regulator.</w:t>
-      </w:r>
-    </w:p>
-    <w:p>
-      <w:pPr>
-        <w:pStyle w:val="BodyText"/>
-      </w:pPr>
-      <w:r>
-        <w:rPr>
-          <w:b/>
-          <w:bCs/>
-        </w:rPr>
-        <w:t xml:space="preserve">No legal advice.</w:t>
-      </w:r>
-      <w:r>
-        <w:t xml:space="preserve"> </w:t>
-      </w:r>
-      <w:r>
-        <w:t xml:space="preserve">This page says what a document is and who it addresses. It never says whether</w:t>
-      </w:r>
-      <w:r>
-        <w:t xml:space="preserve"> </w:t>
-      </w:r>
-      <w:r>
-        <w:t xml:space="preserve">you must comply with anything. Whether a regime reaches your organization is decided by a clause and</w:t>
-      </w:r>
-      <w:r>
-        <w:t xml:space="preserve"> </w:t>
-      </w:r>
-      <w:r>
-        <w:t xml:space="preserve">by your counsel, not by a web page.</w:t>
-      </w:r>
-    </w:p>
-    <w:p>
-      <w:pPr>
-        <w:pStyle w:val="BodyText"/>
-      </w:pPr>
-      <w:r>
-        <w:rPr>
-          <w:b/>
-          <w:bCs/>
-        </w:rPr>
-        <w:t xml:space="preserve">No conformance claim.</w:t>
-      </w:r>
-      <w:r>
-        <w:t xml:space="preserve"> </w:t>
-      </w:r>
-      <w:r>
-        <w:t xml:space="preserve">Naming a standard is not alignment with it. Nothing published on this site</w:t>
-      </w:r>
-      <w:r>
-        <w:t xml:space="preserve"> </w:t>
-      </w:r>
-      <w:r>
-        <w:t xml:space="preserve">certifies, scores, or attests to anything.</w:t>
-      </w:r>
-    </w:p>
-    <w:p>
-      <w:pPr>
-        <w:pStyle w:val="BodyText"/>
-      </w:pPr>
-      <w:r>
-        <w:rPr>
-          <w:b/>
-          <w:bCs/>
-        </w:rPr>
-        <w:t xml:space="preserve">No vendor or tool recommendations.</w:t>
-      </w:r>
-      <w:r>
-        <w:t xml:space="preserve"> </w:t>
-      </w:r>
-      <w:r>
-        <w:t xml:space="preserve">No scanner, platform, assessor or format is recommended below,</w:t>
-      </w:r>
-      <w:r>
-        <w:t xml:space="preserve"> </w:t>
-      </w:r>
-      <w:r>
-        <w:t xml:space="preserve">including where two are named side by side.</w:t>
-      </w:r>
-    </w:p>
-    <w:p>
-      <w:pPr>
-        <w:pStyle w:val="BodyText"/>
-      </w:pPr>
-      <w:r>
-        <w:rPr>
-          <w:b/>
-          <w:bCs/>
-        </w:rPr>
-        <w:t xml:space="preserve">Not complete.</w:t>
-      </w:r>
-      <w:r>
-        <w:t xml:space="preserve"> </w:t>
-      </w:r>
-      <w:r>
-        <w:t xml:space="preserve">This page maps at least the items in the tables below, not all of them. The named</w:t>
-      </w:r>
-      <w:r>
-        <w:t xml:space="preserve"> </w:t>
-      </w:r>
-      <w:r>
-        <w:t xml:space="preserve">gaps are in</w:t>
-      </w:r>
-      <w:r>
-        <w:t xml:space="preserve"> </w:t>
-      </w:r>
-      <w:hyperlink w:anchor="what-this-page-did-not-assess">
-        <w:r>
-          <w:rPr>
-            <w:rStyle w:val="Hyperlink"/>
-          </w:rPr>
-          <w:t xml:space="preserve">What this page did not assess</w:t>
-        </w:r>
-      </w:hyperlink>
-      <w:r>
-        <w:t xml:space="preserve">.</w:t>
-      </w:r>
-    </w:p>
-    <w:p>
-      <w:r>
-        <w:pict>
-          <v:rect style="width:0;height:1.5pt" o:hralign="center" o:hrstd="t" o:hr="t"/>
-        </w:pict>
-      </w:r>
-    </w:p>
-    <w:bookmarkEnd w:id="14"/>
-    <w:bookmarkStart w:id="15" w:name="three-questions-in-this-order"/>
-    <w:p>
-      <w:pPr>
-        <w:pStyle w:val="Heading2"/>
-      </w:pPr>
-      <w:r>
-        <w:t xml:space="preserve">Three questions, in this order</w:t>
-      </w:r>
-    </w:p>
-    <w:p>
-      <w:pPr>
-        <w:pStyle w:val="FirstParagraph"/>
-      </w:pPr>
-      <w:r>
-        <w:rPr>
-          <w:b/>
-          <w:bCs/>
-        </w:rPr>
-        <w:t xml:space="preserve">Does it reach me?</w:t>
-      </w:r>
-      <w:r>
-        <w:t xml:space="preserve"> </w:t>
-      </w:r>
-      <w:r>
-        <w:t xml:space="preserve">A fact about your contracts, your markets and your data, not about the</w:t>
-      </w:r>
-      <w:r>
-        <w:t xml:space="preserve"> </w:t>
-      </w:r>
-      <w:r>
-        <w:t xml:space="preserve">document. Start at the</w:t>
-      </w:r>
-      <w:r>
-        <w:t xml:space="preserve"> </w:t>
-      </w:r>
-      <w:hyperlink w:anchor="if-this-is-your-situation">
-        <w:r>
-          <w:rPr>
-            <w:rStyle w:val="Hyperlink"/>
-          </w:rPr>
-          <w:t xml:space="preserve">routing block</w:t>
-        </w:r>
-      </w:hyperlink>
-      <w:r>
-        <w:t xml:space="preserve">.</w:t>
-      </w:r>
-    </w:p>
-    <w:p>
-      <w:pPr>
-        <w:pStyle w:val="BodyText"/>
-      </w:pPr>
-      <w:r>
-        <w:rPr>
-          <w:b/>
-          <w:bCs/>
-        </w:rPr>
-        <w:t xml:space="preserve">Who is it addressed to?</w:t>
-      </w:r>
-      <w:r>
-        <w:t xml:space="preserve"> </w:t>
-      </w:r>
-      <w:r>
-        <w:t xml:space="preserve">This decides whether the document can describe the thing you are being</w:t>
-      </w:r>
-      <w:r>
-        <w:t xml:space="preserve"> </w:t>
-      </w:r>
-      <w:r>
-        <w:t xml:space="preserve">asked for at all. A control catalog written for an organization that operates systems assumes</w:t>
-      </w:r>
-      <w:r>
-        <w:t xml:space="preserve"> </w:t>
-      </w:r>
-      <w:r>
-        <w:t xml:space="preserve">personnel, facilities, an authorization boundary and a contingency plan. A product has none of those,</w:t>
-      </w:r>
-      <w:r>
-        <w:t xml:space="preserve"> </w:t>
-      </w:r>
-      <w:r>
-        <w:t xml:space="preserve">so a producer can honestly claim a correspondence to a named control identifier and nothing more.</w:t>
-      </w:r>
-    </w:p>
-    <w:p>
-      <w:pPr>
-        <w:pStyle w:val="BodyText"/>
-      </w:pPr>
-      <w:r>
-        <w:rPr>
-          <w:b/>
-          <w:bCs/>
-        </w:rPr>
-        <w:t xml:space="preserve">What does it issue?</w:t>
-      </w:r>
-      <w:r>
-        <w:t xml:space="preserve"> </w:t>
-      </w:r>
-      <w:r>
-        <w:t xml:space="preserve">This decides what changes hands. If the artifact you are being asked for does</w:t>
-      </w:r>
-      <w:r>
-        <w:t xml:space="preserve"> </w:t>
-      </w:r>
-      <w:r>
-        <w:t xml:space="preserve">not exist for the standard named, say so and offer what does exist, rather than acquire something</w:t>
-      </w:r>
-      <w:r>
-        <w:t xml:space="preserve"> </w:t>
-      </w:r>
-      <w:r>
-        <w:t xml:space="preserve">that resembles it.</w:t>
-      </w:r>
-    </w:p>
-    <w:p>
-      <w:pPr>
-        <w:pStyle w:val="BodyText"/>
-      </w:pPr>
-      <w:r>
-        <w:t xml:space="preserve">In that order, most of the confusion here resolves before you read a single requirement.</w:t>
-      </w:r>
-    </w:p>
-    <w:p>
-      <w:r>
-        <w:pict>
-          <v:rect style="width:0;height:1.5pt" o:hralign="center" o:hrstd="t" o:hr="t"/>
-        </w:pict>
-      </w:r>
-    </w:p>
-    <w:bookmarkEnd w:id="15"/>
-    <w:bookmarkStart w:id="16" w:name="if-this-is-your-situation"/>
+    <w:bookmarkStart w:id="12" w:name="if-this-is-your-situation"/>
     <w:p>
       <w:pPr>
         <w:pStyle w:val="Heading2"/>
@@ -1269,8 +749,8 @@
         </w:pict>
       </w:r>
     </w:p>
-    <w:bookmarkEnd w:id="16"/>
-    <w:bookmarkStart w:id="17" w:name="cut-one-who-is-it-addressed-to"/>
+    <w:bookmarkEnd w:id="12"/>
+    <w:bookmarkStart w:id="13" w:name="cut-one-who-is-it-addressed-to"/>
     <w:p>
       <w:pPr>
         <w:pStyle w:val="Heading2"/>
@@ -1560,8 +1040,8 @@
         </w:pict>
       </w:r>
     </w:p>
-    <w:bookmarkEnd w:id="17"/>
-    <w:bookmarkStart w:id="18" w:name="cut-two-what-does-it-actually-issue"/>
+    <w:bookmarkEnd w:id="13"/>
+    <w:bookmarkStart w:id="14" w:name="cut-two-what-does-it-actually-issue"/>
     <w:p>
       <w:pPr>
         <w:pStyle w:val="Heading2"/>
@@ -1900,8 +1380,8 @@
         </w:pict>
       </w:r>
     </w:p>
-    <w:bookmarkEnd w:id="18"/>
-    <w:bookmarkStart w:id="22" w:name="addressed-to-a-software-producer"/>
+    <w:bookmarkEnd w:id="14"/>
+    <w:bookmarkStart w:id="18" w:name="addressed-to-a-software-producer"/>
     <w:p>
       <w:pPr>
         <w:pStyle w:val="Heading2"/>
@@ -1924,7 +1404,7 @@
         <w:t xml:space="preserve">arrive only when a customer, a contract or a package ecosystem names them.</w:t>
       </w:r>
     </w:p>
-    <w:bookmarkStart w:id="20" w:name="requirement-shaped-and-binding-items"/>
+    <w:bookmarkStart w:id="16" w:name="requirement-shaped-and-binding-items"/>
     <w:p>
       <w:pPr>
         <w:pStyle w:val="Heading3"/>
@@ -2492,7 +1972,7 @@
       <w:r>
         <w:t xml:space="preserve"> </w:t>
       </w:r>
-      <w:hyperlink r:id="rId19">
+      <w:hyperlink r:id="rId15">
         <w:r>
           <w:rPr>
             <w:rStyle w:val="Hyperlink"/>
@@ -2510,8 +1990,8 @@
         <w:t xml:space="preserve">and claims correspondence with none.</w:t>
       </w:r>
     </w:p>
-    <w:bookmarkEnd w:id="20"/>
-    <w:bookmarkStart w:id="21" w:name="rankings-and-awareness-lists"/>
+    <w:bookmarkEnd w:id="16"/>
+    <w:bookmarkStart w:id="17" w:name="rankings-and-awareness-lists"/>
     <w:p>
       <w:pPr>
         <w:pStyle w:val="Heading3"/>
@@ -2800,9 +2280,9 @@
         </w:pict>
       </w:r>
     </w:p>
-    <w:bookmarkEnd w:id="21"/>
-    <w:bookmarkEnd w:id="22"/>
-    <w:bookmarkStart w:id="27" w:name="X098e3a8f26fc13ca3ead059c5f4e902207fd433"/>
+    <w:bookmarkEnd w:id="17"/>
+    <w:bookmarkEnd w:id="18"/>
+    <w:bookmarkStart w:id="23" w:name="X098e3a8f26fc13ca3ead059c5f4e902207fd433"/>
     <w:p>
       <w:pPr>
         <w:pStyle w:val="Heading2"/>
@@ -2851,7 +2331,7 @@
         <w:t xml:space="preserve">side, covering personal data. Most questions arrive attached to the wrong link.</w:t>
       </w:r>
     </w:p>
-    <w:bookmarkStart w:id="23" w:name="certification-and-program-regimes"/>
+    <w:bookmarkStart w:id="19" w:name="certification-and-program-regimes"/>
     <w:p>
       <w:pPr>
         <w:pStyle w:val="Heading3"/>
@@ -3267,8 +2747,8 @@
         <w:t xml:space="preserve">lightest class only, and the program calls that class transitory: narrow, and not a shortcut.</w:t>
       </w:r>
     </w:p>
-    <w:bookmarkEnd w:id="23"/>
-    <w:bookmarkStart w:id="24" w:name="sector-and-jurisdiction-regimes"/>
+    <w:bookmarkEnd w:id="19"/>
+    <w:bookmarkStart w:id="20" w:name="sector-and-jurisdiction-regimes"/>
     <w:p>
       <w:pPr>
         <w:pStyle w:val="Heading3"/>
@@ -3701,8 +3181,8 @@
         <w:t xml:space="preserve">no party can supply.</w:t>
       </w:r>
     </w:p>
-    <w:bookmarkEnd w:id="24"/>
-    <w:bookmarkStart w:id="26" w:name="control-catalogs-and-operational-inputs"/>
+    <w:bookmarkEnd w:id="20"/>
+    <w:bookmarkStart w:id="22" w:name="control-catalogs-and-operational-inputs"/>
     <w:p>
       <w:pPr>
         <w:pStyle w:val="Heading3"/>
@@ -4123,7 +3603,7 @@
       <w:r>
         <w:t xml:space="preserve"> </w:t>
       </w:r>
-      <w:hyperlink r:id="rId25">
+      <w:hyperlink r:id="rId21">
         <w:r>
           <w:rPr>
             <w:rStyle w:val="Hyperlink"/>
@@ -4145,9 +3625,9 @@
         </w:pict>
       </w:r>
     </w:p>
-    <w:bookmarkEnd w:id="26"/>
-    <w:bookmarkEnd w:id="27"/>
-    <w:bookmarkStart w:id="28" w:name="addressed-to-an-assessor"/>
+    <w:bookmarkEnd w:id="22"/>
+    <w:bookmarkEnd w:id="23"/>
+    <w:bookmarkStart w:id="24" w:name="addressed-to-an-assessor"/>
     <w:p>
       <w:pPr>
         <w:pStyle w:val="Heading2"/>
@@ -4395,8 +3875,8 @@
         </w:pict>
       </w:r>
     </w:p>
-    <w:bookmarkEnd w:id="28"/>
-    <w:bookmarkStart w:id="30" w:name="Xec900c179c77a160799081f930559b144a7abc9"/>
+    <w:bookmarkEnd w:id="24"/>
+    <w:bookmarkStart w:id="26" w:name="Xec900c179c77a160799081f930559b144a7abc9"/>
     <w:p>
       <w:pPr>
         <w:pStyle w:val="Heading2"/>
@@ -4776,7 +4256,7 @@
       <w:r>
         <w:t xml:space="preserve"> </w:t>
       </w:r>
-      <w:hyperlink r:id="rId29">
+      <w:hyperlink r:id="rId25">
         <w:r>
           <w:rPr>
             <w:rStyle w:val="Hyperlink"/>
@@ -4804,8 +4284,8 @@
         </w:pict>
       </w:r>
     </w:p>
-    <w:bookmarkEnd w:id="30"/>
-    <w:bookmarkStart w:id="31" w:name="how-these-actually-reach-you"/>
+    <w:bookmarkEnd w:id="26"/>
+    <w:bookmarkStart w:id="27" w:name="how-these-actually-reach-you"/>
     <w:p>
       <w:pPr>
         <w:pStyle w:val="Heading2"/>
@@ -5147,8 +4627,8 @@
         </w:pict>
       </w:r>
     </w:p>
-    <w:bookmarkEnd w:id="31"/>
-    <w:bookmarkStart w:id="33" w:name="why-every-status-here-carries-a-date"/>
+    <w:bookmarkEnd w:id="27"/>
+    <w:bookmarkStart w:id="29" w:name="why-every-status-here-carries-a-date"/>
     <w:p>
       <w:pPr>
         <w:pStyle w:val="Heading2"/>
@@ -5176,7 +4656,7 @@
         <w:pStyle w:val="Compact"/>
         <w:numPr>
           <w:ilvl w:val="0"/>
-          <w:numId w:val="1002"/>
+          <w:numId w:val="1001"/>
         </w:numPr>
       </w:pPr>
       <w:r>
@@ -5204,7 +4684,7 @@
         <w:pStyle w:val="Compact"/>
         <w:numPr>
           <w:ilvl w:val="0"/>
-          <w:numId w:val="1002"/>
+          <w:numId w:val="1001"/>
         </w:numPr>
       </w:pPr>
       <w:r>
@@ -5232,7 +4712,7 @@
         <w:pStyle w:val="Compact"/>
         <w:numPr>
           <w:ilvl w:val="0"/>
-          <w:numId w:val="1002"/>
+          <w:numId w:val="1001"/>
         </w:numPr>
       </w:pPr>
       <w:r>
@@ -5260,7 +4740,7 @@
         <w:pStyle w:val="Compact"/>
         <w:numPr>
           <w:ilvl w:val="0"/>
-          <w:numId w:val="1002"/>
+          <w:numId w:val="1001"/>
         </w:numPr>
       </w:pPr>
       <w:r>
@@ -5397,7 +4877,7 @@
       <w:r>
         <w:t xml:space="preserve"> </w:t>
       </w:r>
-      <w:hyperlink r:id="rId32">
+      <w:hyperlink r:id="rId28">
         <w:r>
           <w:rPr>
             <w:rStyle w:val="Hyperlink"/>
@@ -5437,8 +4917,8 @@
         </w:pict>
       </w:r>
     </w:p>
-    <w:bookmarkEnd w:id="33"/>
-    <w:bookmarkStart w:id="34" w:name="Xd07a5dba652e7af822e7b032ac09a3e93cc331c"/>
+    <w:bookmarkEnd w:id="29"/>
+    <w:bookmarkStart w:id="30" w:name="Xd07a5dba652e7af822e7b032ac09a3e93cc331c"/>
     <w:p>
       <w:pPr>
         <w:pStyle w:val="Heading2"/>
@@ -6025,8 +5505,8 @@
         </w:pict>
       </w:r>
     </w:p>
-    <w:bookmarkEnd w:id="34"/>
-    <w:bookmarkStart w:id="35" w:name="Xf419bb31d4316203dd4fd5a9c399af24e8e654b"/>
+    <w:bookmarkEnd w:id="30"/>
+    <w:bookmarkStart w:id="31" w:name="Xf419bb31d4316203dd4fd5a9c399af24e8e654b"/>
     <w:p>
       <w:pPr>
         <w:pStyle w:val="Heading2"/>
@@ -6072,7 +5552,7 @@
         <w:pStyle w:val="Compact"/>
         <w:numPr>
           <w:ilvl w:val="0"/>
-          <w:numId w:val="1003"/>
+          <w:numId w:val="1002"/>
         </w:numPr>
       </w:pPr>
       <w:r>
@@ -6112,7 +5592,7 @@
         <w:pStyle w:val="Compact"/>
         <w:numPr>
           <w:ilvl w:val="0"/>
-          <w:numId w:val="1003"/>
+          <w:numId w:val="1002"/>
         </w:numPr>
       </w:pPr>
       <w:r>
@@ -6146,7 +5626,7 @@
         <w:pStyle w:val="Compact"/>
         <w:numPr>
           <w:ilvl w:val="0"/>
-          <w:numId w:val="1003"/>
+          <w:numId w:val="1002"/>
         </w:numPr>
       </w:pPr>
       <w:r>
@@ -6184,8 +5664,8 @@
         </w:pict>
       </w:r>
     </w:p>
-    <w:bookmarkEnd w:id="35"/>
-    <w:bookmarkStart w:id="36" w:name="what-this-page-did-not-assess"/>
+    <w:bookmarkEnd w:id="31"/>
+    <w:bookmarkStart w:id="32" w:name="what-this-page-did-not-assess"/>
     <w:p>
       <w:pPr>
         <w:pStyle w:val="Heading2"/>
@@ -6707,8 +6187,8 @@
         </w:pict>
       </w:r>
     </w:p>
-    <w:bookmarkEnd w:id="36"/>
-    <w:bookmarkStart w:id="45" w:name="sources-and-how-to-re-check-them"/>
+    <w:bookmarkEnd w:id="32"/>
+    <w:bookmarkStart w:id="41" w:name="sources-and-how-to-re-check-them"/>
     <w:p>
       <w:pPr>
         <w:pStyle w:val="Heading2"/>
@@ -6730,7 +6210,7 @@
         <w:pStyle w:val="Compact"/>
         <w:numPr>
           <w:ilvl w:val="0"/>
-          <w:numId w:val="1004"/>
+          <w:numId w:val="1003"/>
         </w:numPr>
       </w:pPr>
       <w:r>
@@ -6752,7 +6232,7 @@
       <w:r>
         <w:t xml:space="preserve"> </w:t>
       </w:r>
-      <w:hyperlink r:id="rId37">
+      <w:hyperlink r:id="rId33">
         <w:r>
           <w:rPr>
             <w:rStyle w:val="Hyperlink"/>
@@ -6766,7 +6246,7 @@
       <w:r>
         <w:t xml:space="preserve"> </w:t>
       </w:r>
-      <w:hyperlink r:id="rId38">
+      <w:hyperlink r:id="rId34">
         <w:r>
           <w:rPr>
             <w:rStyle w:val="Hyperlink"/>
@@ -6786,7 +6266,7 @@
       <w:r>
         <w:t xml:space="preserve"> </w:t>
       </w:r>
-      <w:hyperlink r:id="rId39">
+      <w:hyperlink r:id="rId35">
         <w:r>
           <w:rPr>
             <w:rStyle w:val="Hyperlink"/>
@@ -6803,7 +6283,7 @@
         <w:pStyle w:val="Compact"/>
         <w:numPr>
           <w:ilvl w:val="0"/>
-          <w:numId w:val="1004"/>
+          <w:numId w:val="1003"/>
         </w:numPr>
       </w:pPr>
       <w:r>
@@ -6819,7 +6299,7 @@
       <w:r>
         <w:t xml:space="preserve"> </w:t>
       </w:r>
-      <w:hyperlink r:id="rId40">
+      <w:hyperlink r:id="rId36">
         <w:r>
           <w:rPr>
             <w:rStyle w:val="Hyperlink"/>
@@ -6839,7 +6319,7 @@
         <w:pStyle w:val="Compact"/>
         <w:numPr>
           <w:ilvl w:val="0"/>
-          <w:numId w:val="1004"/>
+          <w:numId w:val="1003"/>
         </w:numPr>
       </w:pPr>
       <w:r>
@@ -6867,7 +6347,7 @@
         <w:pStyle w:val="Compact"/>
         <w:numPr>
           <w:ilvl w:val="0"/>
-          <w:numId w:val="1004"/>
+          <w:numId w:val="1003"/>
         </w:numPr>
       </w:pPr>
       <w:r>
@@ -6942,7 +6422,7 @@
       <w:r>
         <w:t xml:space="preserve"> </w:t>
       </w:r>
-      <w:hyperlink r:id="rId41">
+      <w:hyperlink r:id="rId37">
         <w:r>
           <w:rPr>
             <w:rStyle w:val="Hyperlink"/>
@@ -6962,7 +6442,7 @@
       <w:r>
         <w:t xml:space="preserve"> </w:t>
       </w:r>
-      <w:hyperlink r:id="rId42">
+      <w:hyperlink r:id="rId38">
         <w:r>
           <w:rPr>
             <w:rStyle w:val="Hyperlink"/>
@@ -6982,7 +6462,7 @@
       <w:r>
         <w:t xml:space="preserve"> </w:t>
       </w:r>
-      <w:hyperlink r:id="rId43">
+      <w:hyperlink r:id="rId39">
         <w:r>
           <w:rPr>
             <w:rStyle w:val="Hyperlink"/>
@@ -6996,7 +6476,7 @@
       <w:r>
         <w:t xml:space="preserve"> </w:t>
       </w:r>
-      <w:hyperlink r:id="rId44">
+      <w:hyperlink r:id="rId40">
         <w:r>
           <w:rPr>
             <w:rStyle w:val="Hyperlink"/>
@@ -7015,8 +6495,8 @@
         </w:pict>
       </w:r>
     </w:p>
-    <w:bookmarkEnd w:id="45"/>
-    <w:bookmarkStart w:id="50" w:name="related-pages-on-this-site"/>
+    <w:bookmarkEnd w:id="41"/>
+    <w:bookmarkStart w:id="47" w:name="related-pages-on-this-site"/>
     <w:p>
       <w:pPr>
         <w:pStyle w:val="Heading2"/>
@@ -7080,7 +6560,7 @@
             <w:pPr>
               <w:pStyle w:val="Compact"/>
             </w:pPr>
-            <w:hyperlink r:id="rId13">
+            <w:hyperlink r:id="rId42">
               <w:r>
                 <w:rPr>
                   <w:rStyle w:val="Hyperlink"/>
@@ -7109,7 +6589,7 @@
             <w:pPr>
               <w:pStyle w:val="Compact"/>
             </w:pPr>
-            <w:hyperlink r:id="rId46">
+            <w:hyperlink r:id="rId43">
               <w:r>
                 <w:rPr>
                   <w:rStyle w:val="Hyperlink"/>
@@ -7138,7 +6618,7 @@
             <w:pPr>
               <w:pStyle w:val="Compact"/>
             </w:pPr>
-            <w:hyperlink r:id="rId47">
+            <w:hyperlink r:id="rId44">
               <w:r>
                 <w:rPr>
                   <w:rStyle w:val="Hyperlink"/>
@@ -7167,7 +6647,7 @@
             <w:pPr>
               <w:pStyle w:val="Compact"/>
             </w:pPr>
-            <w:hyperlink r:id="rId25">
+            <w:hyperlink r:id="rId21">
               <w:r>
                 <w:rPr>
                   <w:rStyle w:val="Hyperlink"/>
@@ -7196,7 +6676,7 @@
             <w:pPr>
               <w:pStyle w:val="Compact"/>
             </w:pPr>
-            <w:hyperlink r:id="rId19">
+            <w:hyperlink r:id="rId15">
               <w:r>
                 <w:rPr>
                   <w:rStyle w:val="Hyperlink"/>
@@ -7225,7 +6705,7 @@
             <w:pPr>
               <w:pStyle w:val="Compact"/>
             </w:pPr>
-            <w:hyperlink r:id="rId29">
+            <w:hyperlink r:id="rId25">
               <w:r>
                 <w:rPr>
                   <w:rStyle w:val="Hyperlink"/>
@@ -7254,7 +6734,7 @@
             <w:pPr>
               <w:pStyle w:val="Compact"/>
             </w:pPr>
-            <w:hyperlink r:id="rId32">
+            <w:hyperlink r:id="rId28">
               <w:r>
                 <w:rPr>
                   <w:rStyle w:val="Hyperlink"/>
@@ -7283,7 +6763,7 @@
             <w:pPr>
               <w:pStyle w:val="Compact"/>
             </w:pPr>
-            <w:hyperlink r:id="rId48">
+            <w:hyperlink r:id="rId45">
               <w:r>
                 <w:rPr>
                   <w:rStyle w:val="Hyperlink"/>
@@ -7312,7 +6792,7 @@
             <w:pPr>
               <w:pStyle w:val="Compact"/>
             </w:pPr>
-            <w:hyperlink r:id="rId49">
+            <w:hyperlink r:id="rId46">
               <w:r>
                 <w:rPr>
                   <w:rStyle w:val="Hyperlink"/>
@@ -7408,8 +6888,8 @@
         <w:t xml:space="preserve">Re-date it when you do: a status claim inherits the date it was checked, not the date it was copied.</w:t>
       </w:r>
     </w:p>
-    <w:bookmarkEnd w:id="50"/>
-    <w:bookmarkEnd w:id="51"/>
+    <w:bookmarkEnd w:id="47"/>
+    <w:bookmarkEnd w:id="48"/>
     <w:sectPr>
       <w:footnotePr>
         <w:numRestart w:val="eachSect"/>
@@ -7520,6 +7000,91 @@
       </w:pPr>
     </w:lvl>
   </w:abstractNum>
+  <w:abstractNum w:abstractNumId="99411">
+    <w:nsid w:val="00A99411"/>
+    <w:multiLevelType w:val="multilevel"/>
+    <w:lvl w:ilvl="0">
+      <w:start w:val="1"/>
+      <w:numFmt w:val="decimal"/>
+      <w:lvlText w:val="%1."/>
+      <w:lvlJc w:val="left"/>
+      <w:pPr>
+        <w:ind w:left="720" w:hanging="360"/>
+      </w:pPr>
+    </w:lvl>
+    <w:lvl w:ilvl="1">
+      <w:start w:val="1"/>
+      <w:numFmt w:val="decimal"/>
+      <w:lvlText w:val="%2."/>
+      <w:lvlJc w:val="left"/>
+      <w:pPr>
+        <w:ind w:left="1440" w:hanging="360"/>
+      </w:pPr>
+    </w:lvl>
+    <w:lvl w:ilvl="2">
+      <w:start w:val="1"/>
+      <w:numFmt w:val="decimal"/>
+      <w:lvlText w:val="%3."/>
+      <w:lvlJc w:val="left"/>
+      <w:pPr>
+        <w:ind w:left="2160" w:hanging="360"/>
+      </w:pPr>
+    </w:lvl>
+    <w:lvl w:ilvl="3">
+      <w:start w:val="1"/>
+      <w:numFmt w:val="decimal"/>
+      <w:lvlText w:val="%4."/>
+      <w:lvlJc w:val="left"/>
+      <w:pPr>
+        <w:ind w:left="2880" w:hanging="360"/>
+      </w:pPr>
+    </w:lvl>
+    <w:lvl w:ilvl="4">
+      <w:start w:val="1"/>
+      <w:numFmt w:val="decimal"/>
+      <w:lvlText w:val="%5."/>
+      <w:lvlJc w:val="left"/>
+      <w:pPr>
+        <w:ind w:left="3600" w:hanging="360"/>
+      </w:pPr>
+    </w:lvl>
+    <w:lvl w:ilvl="5">
+      <w:start w:val="1"/>
+      <w:numFmt w:val="decimal"/>
+      <w:lvlText w:val="%6."/>
+      <w:lvlJc w:val="left"/>
+      <w:pPr>
+        <w:ind w:left="4320" w:hanging="360"/>
+      </w:pPr>
+    </w:lvl>
+    <w:lvl w:ilvl="6">
+      <w:start w:val="1"/>
+      <w:numFmt w:val="decimal"/>
+      <w:lvlText w:val="%7."/>
+      <w:lvlJc w:val="left"/>
+      <w:pPr>
+        <w:ind w:left="5040" w:hanging="360"/>
+      </w:pPr>
+    </w:lvl>
+    <w:lvl w:ilvl="7">
+      <w:start w:val="1"/>
+      <w:numFmt w:val="decimal"/>
+      <w:lvlText w:val="%8."/>
+      <w:lvlJc w:val="left"/>
+      <w:pPr>
+        <w:ind w:left="5760" w:hanging="360"/>
+      </w:pPr>
+    </w:lvl>
+    <w:lvl w:ilvl="8">
+      <w:start w:val="1"/>
+      <w:numFmt w:val="decimal"/>
+      <w:lvlText w:val="%9."/>
+      <w:lvlJc w:val="left"/>
+      <w:pPr>
+        <w:ind w:left="6480" w:hanging="360"/>
+      </w:pPr>
+    </w:lvl>
+  </w:abstractNum>
   <w:abstractNum w:abstractNumId="991">
     <w:nsid w:val="0000A991"/>
     <w:multiLevelType w:val="multilevel"/>
@@ -7623,98 +7188,10 @@
       </w:rPr>
     </w:lvl>
   </w:abstractNum>
-  <w:abstractNum w:abstractNumId="99411">
-    <w:nsid w:val="00A99411"/>
-    <w:multiLevelType w:val="multilevel"/>
-    <w:lvl w:ilvl="0">
-      <w:start w:val="1"/>
-      <w:numFmt w:val="decimal"/>
-      <w:lvlText w:val="%1."/>
-      <w:lvlJc w:val="left"/>
-      <w:pPr>
-        <w:ind w:left="720" w:hanging="360"/>
-      </w:pPr>
-    </w:lvl>
-    <w:lvl w:ilvl="1">
-      <w:start w:val="1"/>
-      <w:numFmt w:val="decimal"/>
-      <w:lvlText w:val="%2."/>
-      <w:lvlJc w:val="left"/>
-      <w:pPr>
-        <w:ind w:left="1440" w:hanging="360"/>
-      </w:pPr>
-    </w:lvl>
-    <w:lvl w:ilvl="2">
-      <w:start w:val="1"/>
-      <w:numFmt w:val="decimal"/>
-      <w:lvlText w:val="%3."/>
-      <w:lvlJc w:val="left"/>
-      <w:pPr>
-        <w:ind w:left="2160" w:hanging="360"/>
-      </w:pPr>
-    </w:lvl>
-    <w:lvl w:ilvl="3">
-      <w:start w:val="1"/>
-      <w:numFmt w:val="decimal"/>
-      <w:lvlText w:val="%4."/>
-      <w:lvlJc w:val="left"/>
-      <w:pPr>
-        <w:ind w:left="2880" w:hanging="360"/>
-      </w:pPr>
-    </w:lvl>
-    <w:lvl w:ilvl="4">
-      <w:start w:val="1"/>
-      <w:numFmt w:val="decimal"/>
-      <w:lvlText w:val="%5."/>
-      <w:lvlJc w:val="left"/>
-      <w:pPr>
-        <w:ind w:left="3600" w:hanging="360"/>
-      </w:pPr>
-    </w:lvl>
-    <w:lvl w:ilvl="5">
-      <w:start w:val="1"/>
-      <w:numFmt w:val="decimal"/>
-      <w:lvlText w:val="%6."/>
-      <w:lvlJc w:val="left"/>
-      <w:pPr>
-        <w:ind w:left="4320" w:hanging="360"/>
-      </w:pPr>
-    </w:lvl>
-    <w:lvl w:ilvl="6">
-      <w:start w:val="1"/>
-      <w:numFmt w:val="decimal"/>
-      <w:lvlText w:val="%7."/>
-      <w:lvlJc w:val="left"/>
-      <w:pPr>
-        <w:ind w:left="5040" w:hanging="360"/>
-      </w:pPr>
-    </w:lvl>
-    <w:lvl w:ilvl="7">
-      <w:start w:val="1"/>
-      <w:numFmt w:val="decimal"/>
-      <w:lvlText w:val="%8."/>
-      <w:lvlJc w:val="left"/>
-      <w:pPr>
-        <w:ind w:left="5760" w:hanging="360"/>
-      </w:pPr>
-    </w:lvl>
-    <w:lvl w:ilvl="8">
-      <w:start w:val="1"/>
-      <w:numFmt w:val="decimal"/>
-      <w:lvlText w:val="%9."/>
-      <w:lvlJc w:val="left"/>
-      <w:pPr>
-        <w:ind w:left="6480" w:hanging="360"/>
-      </w:pPr>
-    </w:lvl>
-  </w:abstractNum>
   <w:num w:numId="1000">
     <w:abstractNumId w:val="990"/>
   </w:num>
   <w:num w:numId="1001">
-    <w:abstractNumId w:val="991"/>
-  </w:num>
-  <w:num w:numId="1002">
     <w:abstractNumId w:val="99411"/>
     <w:lvlOverride w:ilvl="0">
       <w:startOverride w:val="1"/>
@@ -7744,10 +7221,10 @@
       <w:startOverride w:val="1"/>
     </w:lvlOverride>
   </w:num>
-  <w:num w:numId="1003">
+  <w:num w:numId="1002">
     <w:abstractNumId w:val="991"/>
   </w:num>
-  <w:num w:numId="1004">
+  <w:num w:numId="1003">
     <w:abstractNumId w:val="991"/>
   </w:num>
 </w:numbering>

</xml_diff>